<commit_message>
Registra a fonte do índice per capita de brita ES (RAL/AMB-ANM) na trilha de auditoria e nas referências
O índice 1,6-1,7 t/hab/ano (Carta v7 §3 e Estudo v4 §6.2) entrou no
fact-check da v7 sem URL registrada. Agora:
- plano_producao: linha nova na trilha de auditoria (status 'a validar na
  fonte' com roteiro de 5 min) + links AMB/dados abertos na seção Fontes
- Estudo v4: remissão [27] no §6.2, item de validação no §11 e referência
  [27] completa (dataset AMB, painel interativo, página ANM)
Sanidade documentada: Brasil 2023 ~272 mi t (~1,34 t/hab); SP ~1,62 t/hab.
Acesso à fonte primária bloqueado pelo proxy nesta sessão (gov.br e PowerBI).

Co-Authored-By: Claude Fable 5 <noreply@anthropic.com>
Claude-Session: https://claude.ai/code/session_01DqEaERD1LDFtugtNrL73cp
</commit_message>
<xml_diff>
--- a/Estudo_Mercado_CIPREM_Britagem_SaoMateus_v4.docx
+++ b/Estudo_Mercado_CIPREM_Britagem_SaoMateus_v4.docx
@@ -3999,6 +3999,9 @@
         </w:rPr>
       </w:r>
       <w:r/>
+      <w:r>
+        <w:t xml:space="preserve"> Fonte do índice: vendas declaradas no RAL, consolidadas pela ANM no Anuário Mineral Brasileiro/AMB [27].</w:t>
+      </w:r>
     </w:p>
     <w:p>
       <w:pPr>
@@ -6368,6 +6371,25 @@
     </w:p>
     <w:p>
       <w:pPr>
+        <w:pStyle w:val="ListParagraph"/>
+        <w:numPr>
+          <w:ilvl w:val="0"/>
+          <w:numId w:val="2"/>
+        </w:numPr>
+        <w:spacing w:after="80" w:line="270"/>
+        <w:jc w:val="both"/>
+      </w:pPr>
+      <w:r>
+        <w:rPr>
+          <w:b/>
+          <w:bCs/>
+        </w:rPr>
+        <w:t>Validação do índice per capita de brita (1,6–1,7 t/hab/ano, item 6.2) na fonte primária: abrir o painel AMB Interativo da ANM (ou o dataset AMB em dados.gov.br [27]), filtrar UF = ES e substância pedra britada/granito britado, ler a quantidade comercializada em 2023–2024 e dividir pela população do ES (4,10–4,13 milhões — IBGE): a faixa deve reproduzir 1,6–1,7. O acesso esteve bloqueado no ambiente desta consultoria; a sanidade nacional confere (Brasil 2023 ≈ 272 mi t ≈ 1,34 t/hab; SP ≈ 72 mi t ≈ 1,62 t/hab).</w:t>
+      </w:r>
+      <w:r/>
+    </w:p>
+    <w:p>
+      <w:pPr>
         <w:pStyle w:val="Heading1"/>
       </w:pPr>
       <w:r>
@@ -7022,6 +7044,28 @@
           <w:bCs/>
         </w:rPr>
         <w:t>[26] Prefeitura de Barra de São Francisco — britador municipal de casqueiro em Vila Paulista (uso público): indicador da ausência de britagem comercial de resíduo ornamental no noroeste capixaba. Acesso em: 11/08/2026.</w:t>
+      </w:r>
+      <w:r/>
+      <w:hyperlink w:history="1" r:id="rId3_wqtjdgkthv5lcjejcb0">
+        <w:r>
+          <w:rPr>
+            <w:rStyle w:val="Hyperlink"/>
+          </w:rPr>
+          <w:t xml:space="preserve">https://cidades.ibge.gov.br/brasil/es/sao-mateus/panorama</w:t>
+        </w:r>
+      </w:hyperlink>
+      <w:r/>
+    </w:p>
+    <w:p>
+      <w:pPr>
+        <w:spacing w:after="100" w:line="264"/>
+      </w:pPr>
+      <w:r>
+        <w:rPr>
+          <w:b/>
+          <w:bCs/>
+        </w:rPr>
+        <w:t>[27] ANM — Anuário Mineral Brasileiro (AMB), dados abertos: produção/comercialização por UF e substância, consolidada do Relatório Anual de Lavra (RAL); base do índice per capita de brita do ES usado no item 6.2. Disponível em: https://dados.gov.br/dados/conjuntos-dados/anuario-mineral-brasileiro-amb (painel: "Anuário Mineral Brasileiro Interativo", app.powerbi.com; página: https://www.gov.br/anm/pt-br/assuntos/economia-mineral/publicacoes/anuario-mineral/anuario-mineral-brasileiro). Acesso em: 11/08/2026 — valor do ES a validar na fonte (ver item 11).</w:t>
       </w:r>
       <w:r/>
       <w:hyperlink w:history="1" r:id="rId3_wqtjdgkthv5lcjejcb0">

</xml_diff>